<commit_message>
Refine deed fields and templates
</commit_message>
<xml_diff>
--- a/sale-deed-template-v2.docx
+++ b/sale-deed-template-v2.docx
@@ -1,6 +1,6 @@
 
 <file path=word/document.xml><?xml version="1.0" encoding="utf-8"?>
-<w:document xmlns:ve="http://schemas.openxmlformats.org/markup-compatibility/2006" xmlns:o="urn:schemas-microsoft-com:office:office" xmlns:r="http://schemas.openxmlformats.org/officeDocument/2006/relationships" xmlns:m="http://schemas.openxmlformats.org/officeDocument/2006/math" xmlns:v="urn:schemas-microsoft-com:vml" xmlns:wp="http://schemas.openxmlformats.org/drawingml/2006/wordprocessingDrawing" xmlns:w10="urn:schemas-microsoft-com:office:word" xmlns:w="http://schemas.openxmlformats.org/wordprocessingml/2006/main" xmlns:wne="http://schemas.microsoft.com/office/word/2006/wordml">
+<w:document xmlns:ns1="http://schemas.openxmlformats.org/officeDocument/2006/relationships" xmlns:w="http://schemas.openxmlformats.org/wordprocessingml/2006/main">
   <w:body>
     <w:p>
       <w:pPr>
@@ -1843,7 +1843,7 @@
           <w:szCs w:val="28"/>
         </w:rPr>
         <w:sectPr>
-          <w:footerReference w:type="default" r:id="rId8"/>
+          <w:footerReference w:type="default" ns1:id="rId8"/>
           <w:pgSz w:w="11920" w:h="16840"/>
           <w:pgMar w:top="8208" w:right="1080" w:bottom="1080" w:left="1080" w:header="720" w:footer="720" w:gutter="0"/>
           <w:cols w:space="720"/>
@@ -3883,6 +3883,156 @@
           <w:szCs w:val="28"/>
         </w:rPr>
         <w:t>.</w:t>
+      </w:r>
+    </w:p>
+    <w:p>
+      <w:pPr>
+        <w:pStyle w:val="BodyText"/>
+        <w:numPr>
+          <w:ilvl w:val="0"/>
+          <w:numId w:val="18"/>
+        </w:numPr>
+        <w:spacing w:before="100" w:beforeAutospacing="1" w:after="120"/>
+        <w:ind w:left="0" w:firstLine="432"/>
+        <w:jc w:val="both"/>
+        <w:rPr>
+          <w:rFonts w:ascii="Times New Roman" w:hAnsi="Times New Roman" w:cs="Times New Roman"/>
+          <w:sz w:val="28"/>
+          <w:szCs w:val="28"/>
+        </w:rPr>
+      </w:pPr>
+      <w:proofErr w:type="spellStart"/>
+      <w:r>
+        <w:rPr>
+          <w:rFonts w:ascii="Times New Roman" w:hAnsi="Times New Roman" w:cs="Times New Roman"/>
+          <w:b/>
+          <w:bCs/>
+          <w:sz w:val="28"/>
+          <w:szCs w:val="28"/>
+        </w:rPr>
+        <w:t>Housing Loan: Amount of Rs.&lt;Amount&gt;/- paid through having availed housing loan from &lt;Housing Loan Bank&gt;, &lt;Housing Loan Bank&gt; Branch, Cheque No. &lt;Cheque No.&gt;, dated &lt;Date&gt; by the Vendee/s, namely &lt;Claimant Name&gt;, to the Vendor/s, namely &lt;Executant Name&gt;.</w:t>
+      </w:r>
+      <w:proofErr w:type="gramStart"/>
+      <w:r>
+        <w:rPr>
+          <w:rFonts w:ascii="Times New Roman" w:hAnsi="Times New Roman" w:cs="Times New Roman"/>
+          <w:sz w:val="28"/>
+          <w:szCs w:val="28"/>
+        </w:rPr>
+        <w:t/>
+      </w:r>
+      <w:r>
+        <w:rPr>
+          <w:rStyle w:val="Strong"/>
+          <w:rFonts w:ascii="Times New Roman" w:hAnsi="Times New Roman" w:cs="Times New Roman"/>
+          <w:b w:val="0"/>
+          <w:bCs w:val="0"/>
+          <w:sz w:val="28"/>
+          <w:szCs w:val="28"/>
+        </w:rPr>
+        <w:t/>
+      </w:r>
+      <w:proofErr w:type="spellEnd"/>
+      <w:proofErr w:type="gramEnd"/>
+      <w:r>
+        <w:rPr>
+          <w:rStyle w:val="Strong"/>
+          <w:rFonts w:ascii="Times New Roman" w:hAnsi="Times New Roman" w:cs="Times New Roman"/>
+          <w:b w:val="0"/>
+          <w:bCs w:val="0"/>
+          <w:sz w:val="28"/>
+          <w:szCs w:val="28"/>
+        </w:rPr>
+        <w:t xml:space="preserve"/>
+      </w:r>
+      <w:r>
+        <w:rPr>
+          <w:rFonts w:ascii="Times New Roman" w:hAnsi="Times New Roman" w:cs="Times New Roman"/>
+          <w:sz w:val="28"/>
+          <w:szCs w:val="28"/>
+        </w:rPr>
+        <w:t xml:space="preserve"/>
+      </w:r>
+      <w:r>
+        <w:rPr>
+          <w:rStyle w:val="Strong"/>
+          <w:rFonts w:ascii="Times New Roman" w:hAnsi="Times New Roman" w:cs="Times New Roman"/>
+          <w:b w:val="0"/>
+          <w:bCs w:val="0"/>
+          <w:sz w:val="28"/>
+          <w:szCs w:val="28"/>
+        </w:rPr>
+        <w:t/>
+      </w:r>
+      <w:r>
+        <w:rPr>
+          <w:rFonts w:ascii="Times New Roman" w:hAnsi="Times New Roman" w:cs="Times New Roman"/>
+          <w:sz w:val="28"/>
+          <w:szCs w:val="28"/>
+        </w:rPr>
+        <w:t xml:space="preserve"/>
+      </w:r>
+      <w:r>
+        <w:rPr>
+          <w:rStyle w:val="Strong"/>
+          <w:rFonts w:ascii="Times New Roman" w:hAnsi="Times New Roman" w:cs="Times New Roman"/>
+          <w:b w:val="0"/>
+          <w:bCs w:val="0"/>
+          <w:sz w:val="28"/>
+          <w:szCs w:val="28"/>
+        </w:rPr>
+        <w:t/>
+      </w:r>
+      <w:proofErr w:type="spellStart"/>
+      <w:r>
+        <w:rPr>
+          <w:rStyle w:val="Strong"/>
+          <w:rFonts w:ascii="Times New Roman" w:hAnsi="Times New Roman" w:cs="Times New Roman"/>
+          <w:b w:val="0"/>
+          <w:bCs w:val="0"/>
+          <w:sz w:val="28"/>
+          <w:szCs w:val="28"/>
+        </w:rPr>
+        <w:t/>
+      </w:r>
+      <w:proofErr w:type="spellEnd"/>
+      <w:r>
+        <w:rPr>
+          <w:rStyle w:val="Strong"/>
+          <w:rFonts w:ascii="Times New Roman" w:hAnsi="Times New Roman" w:cs="Times New Roman"/>
+          <w:b w:val="0"/>
+          <w:bCs w:val="0"/>
+          <w:sz w:val="28"/>
+          <w:szCs w:val="28"/>
+        </w:rPr>
+        <w:t xml:space="preserve"/>
+      </w:r>
+      <w:r>
+        <w:rPr>
+          <w:rFonts w:ascii="Times New Roman" w:hAnsi="Times New Roman" w:cs="Times New Roman"/>
+          <w:sz w:val="28"/>
+          <w:szCs w:val="28"/>
+        </w:rPr>
+        <w:t xml:space="preserve"/>
+      </w:r>
+      <w:r>
+        <w:rPr>
+          <w:rStyle w:val="Strong"/>
+          <w:rFonts w:ascii="Times New Roman" w:hAnsi="Times New Roman" w:cs="Times New Roman"/>
+          <w:b w:val="0"/>
+          <w:bCs w:val="0"/>
+          <w:sz w:val="28"/>
+          <w:szCs w:val="28"/>
+        </w:rPr>
+        <w:t/>
+      </w:r>
+      <w:r>
+        <w:rPr>
+          <w:rFonts w:ascii="Times New Roman" w:hAnsi="Times New Roman" w:cs="Times New Roman"/>
+          <w:sz w:val="28"/>
+          <w:szCs w:val="28"/>
+        </w:rPr>
+        <w:t/>
       </w:r>
     </w:p>
     <w:p>

</xml_diff>

<commit_message>
Update roof nature deed fields
</commit_message>
<xml_diff>
--- a/sale-deed-template-v2.docx
+++ b/sale-deed-template-v2.docx
@@ -3883,6 +3883,18 @@
           <w:szCs w:val="28"/>
         </w:rPr>
         <w:t>.</w:t>
+      </w:r>
+    </w:p>
+    <w:p>
+      <w:pPr>
+        <w:spacing w:after="40"/>
+      </w:pPr>
+      <w:r>
+        <w:rPr>
+          <w:rFonts w:ascii="Times New Roman" w:hAnsi="Times New Roman"/>
+          <w:sz w:val="24"/>
+        </w:rPr>
+        <w:t xml:space="preserve">Housing Loan: Amount of Rs.&lt;Amount&gt;/- paid through having availed housing loan from &lt;Housing Loan Bank&gt;, &lt;Housing Loan Bank&gt; Branch, Cheque No. &lt;Cheque No.&gt;, dated &lt;Date&gt; by the Vendee/s, namely &lt;Claimant Name&gt;, to the Vendor/s, namely &lt;Executant Name&gt;.</w:t>
       </w:r>
     </w:p>
     <w:p>
@@ -12047,6 +12059,181 @@
           <w:u w:val="single"/>
         </w:rPr>
       </w:pPr>
+    </w:p>
+    <w:p>
+      <w:pPr>
+        <w:spacing w:after="40"/>
+        <w:jc w:val="center"/>
+      </w:pPr>
+      <w:r>
+        <w:rPr>
+          <w:rFonts w:ascii="Times New Roman" w:hAnsi="Times New Roman"/>
+          <w:sz w:val="24"/>
+        </w:rPr>
+        <w:t xml:space="preserve">&lt;IF FLAT&gt;</w:t>
+      </w:r>
+    </w:p>
+    <w:p>
+      <w:pPr>
+        <w:spacing w:after="40"/>
+        <w:jc w:val="center"/>
+      </w:pPr>
+      <w:r>
+        <w:rPr>
+          <w:rFonts w:ascii="Times New Roman" w:hAnsi="Times New Roman"/>
+          <w:sz w:val="24"/>
+          <w:b/>
+          <w:u w:val="single"/>
+        </w:rPr>
+        <w:t xml:space="preserve">SCHEDULE OF PROPERTY</w:t>
+      </w:r>
+    </w:p>
+    <w:p>
+      <w:pPr>
+        <w:spacing w:after="40"/>
+        <w:jc w:val="center"/>
+      </w:pPr>
+      <w:r>
+        <w:rPr>
+          <w:rFonts w:ascii="Times New Roman" w:hAnsi="Times New Roman"/>
+          <w:sz w:val="24"/>
+          <w:i/>
+          <w:u w:val="single"/>
+        </w:rPr>
+        <w:t xml:space="preserve">(Description of the property hereby sold)</w:t>
+      </w:r>
+    </w:p>
+    <w:p>
+      <w:pPr>
+        <w:spacing w:after="40"/>
+      </w:pPr>
+      <w:r>
+        <w:rPr>
+          <w:rFonts w:ascii="Times New Roman" w:hAnsi="Times New Roman"/>
+          <w:sz w:val="24"/>
+        </w:rPr>
+        <w:t xml:space="preserve">All that a &lt;Stage&gt; Flat No. &lt;Flat No.&gt; in &lt;Floor No.&gt; Floor, R.C.C. Structure, having a built up area of &lt;Built-up Area&gt; Sq.Fts., (including common area) and Car Parking area, together with undivided share of land &lt;UDS&gt; Sq.yds, out of &lt;Total Land Extent&gt; Sq.Yds., in the complex known as “&lt;Apartment Complex Name&gt;”, constructed in the property covered by Municipal H.Nos. &lt;Municipal House Nos.&gt;, in part plot nos. &lt;Plot Nos.&gt;, in Survey No. &lt;Survey No.&gt;, situated at ‘&lt;Locality&gt;’ locality of &lt;Village&gt; Village, &lt;Mandal&gt; mandal, District:&lt;District&gt;, Pin Code:&lt;Pin Code&gt;, Within the jurisdictional limits of the Competent Local Authority,&lt;Village&gt;, Registration Sub-District: &lt;Sub-Registrar&gt; and within the Registration District: &lt;District Registrar&gt;.</w:t>
+      </w:r>
+    </w:p>
+    <w:p>
+      <w:pPr>
+        <w:spacing w:after="40"/>
+      </w:pPr>
+      <w:r>
+        <w:rPr>
+          <w:rFonts w:ascii="Times New Roman" w:hAnsi="Times New Roman"/>
+          <w:sz w:val="24"/>
+        </w:rPr>
+        <w:t xml:space="preserve">Boundaries of Apartment:</w:t>
+      </w:r>
+    </w:p>
+    <w:p>
+      <w:pPr>
+        <w:spacing w:after="40"/>
+      </w:pPr>
+      <w:r>
+        <w:rPr>
+          <w:rFonts w:ascii="Times New Roman" w:hAnsi="Times New Roman"/>
+          <w:sz w:val="24"/>
+        </w:rPr>
+        <w:t xml:space="preserve">North : &lt;North Boundary of Apartment&gt;,</w:t>
+      </w:r>
+    </w:p>
+    <w:p>
+      <w:pPr>
+        <w:spacing w:after="40"/>
+      </w:pPr>
+      <w:r>
+        <w:rPr>
+          <w:rFonts w:ascii="Times New Roman" w:hAnsi="Times New Roman"/>
+          <w:sz w:val="24"/>
+        </w:rPr>
+        <w:t xml:space="preserve">South : &lt;South Boundary of Apartment&gt;,</w:t>
+      </w:r>
+    </w:p>
+    <w:p>
+      <w:pPr>
+        <w:spacing w:after="40"/>
+      </w:pPr>
+      <w:r>
+        <w:rPr>
+          <w:rFonts w:ascii="Times New Roman" w:hAnsi="Times New Roman"/>
+          <w:sz w:val="24"/>
+        </w:rPr>
+        <w:t xml:space="preserve">East : &lt;East Boundary of Apartment&gt;,</w:t>
+      </w:r>
+    </w:p>
+    <w:p>
+      <w:pPr>
+        <w:spacing w:after="40"/>
+      </w:pPr>
+      <w:r>
+        <w:rPr>
+          <w:rFonts w:ascii="Times New Roman" w:hAnsi="Times New Roman"/>
+          <w:sz w:val="24"/>
+        </w:rPr>
+        <w:t xml:space="preserve">West : &lt;West Boundary of Apartment&gt;.</w:t>
+      </w:r>
+    </w:p>
+    <w:p>
+      <w:pPr>
+        <w:spacing w:after="40"/>
+      </w:pPr>
+      <w:r>
+        <w:rPr>
+          <w:rFonts w:ascii="Times New Roman" w:hAnsi="Times New Roman"/>
+          <w:sz w:val="24"/>
+        </w:rPr>
+        <w:t xml:space="preserve">Boundaries of Flat No.&lt;Flat No.&gt; in &lt;Floor No.&gt; Floor:</w:t>
+      </w:r>
+    </w:p>
+    <w:p>
+      <w:pPr>
+        <w:spacing w:after="40"/>
+      </w:pPr>
+      <w:r>
+        <w:rPr>
+          <w:rFonts w:ascii="Times New Roman" w:hAnsi="Times New Roman"/>
+          <w:sz w:val="24"/>
+        </w:rPr>
+        <w:t xml:space="preserve">North : &lt;North Boundary of Flat&gt;,</w:t>
+      </w:r>
+    </w:p>
+    <w:p>
+      <w:pPr>
+        <w:spacing w:after="40"/>
+      </w:pPr>
+      <w:r>
+        <w:rPr>
+          <w:rFonts w:ascii="Times New Roman" w:hAnsi="Times New Roman"/>
+          <w:sz w:val="24"/>
+        </w:rPr>
+        <w:t xml:space="preserve">South : &lt;South Boundary of Flat&gt;,</w:t>
+      </w:r>
+    </w:p>
+    <w:p>
+      <w:pPr>
+        <w:spacing w:after="40"/>
+      </w:pPr>
+      <w:r>
+        <w:rPr>
+          <w:rFonts w:ascii="Times New Roman" w:hAnsi="Times New Roman"/>
+          <w:sz w:val="24"/>
+        </w:rPr>
+        <w:t xml:space="preserve">East : &lt;East Boundary of Flat&gt;,</w:t>
+      </w:r>
+    </w:p>
+    <w:p>
+      <w:pPr>
+        <w:spacing w:after="40"/>
+      </w:pPr>
+      <w:r>
+        <w:rPr>
+          <w:rFonts w:ascii="Times New Roman" w:hAnsi="Times New Roman"/>
+          <w:sz w:val="24"/>
+        </w:rPr>
+        <w:t xml:space="preserve">West : &lt;West Boundary of Flat&gt;.</w:t>
+      </w:r>
     </w:p>
     <w:p/>
     <w:p/>

</xml_diff>